<commit_message>
feat: complete UI/UX OTA polish, 99-test suite, diagrams and final documentation
</commit_message>
<xml_diff>
--- a/KICH_BAN_TEST_VA_DEMO_TOURBOOKING.docx
+++ b/KICH_BAN_TEST_VA_DEMO_TOURBOOKING.docx
@@ -48,43 +48,13 @@
     </w:p>
     <w:p>
       <w:r>
-        <w:rPr>
-          <w:b/>
-        </w:rPr>
-        <w:t xml:space="preserve">• Frontend (React 18 + Vite 5 + TailwindCSS): </w:t>
-      </w:r>
-      <w:r>
-        <w:t>http://localhost:3000</w:t>
+        <w:t>• Frontend (React 18 + Vite 5 + UI-UX Pro Max Design Tokens (CSS3)): http://localhost:3000</w:t>
         <w:br/>
-      </w:r>
-      <w:r>
-        <w:rPr>
-          <w:b/>
-        </w:rPr>
-        <w:t xml:space="preserve">• Backend API (Spring Boot 3.5.6 + Java 17 LTS): </w:t>
-      </w:r>
-      <w:r>
-        <w:t>http://localhost:8080/api</w:t>
+        <w:t>• Backend API (Spring Boot 3.5.6 + Java 17 LTS): http://localhost:8080/api</w:t>
         <w:br/>
-      </w:r>
-      <w:r>
-        <w:rPr>
-          <w:b/>
-        </w:rPr>
-        <w:t xml:space="preserve">• Cơ sở dữ liệu quan hệ: </w:t>
-      </w:r>
-      <w:r>
-        <w:t>MariaDB 12.2 (tourbookingdb, user: root, pass: 12345678)</w:t>
+        <w:t>• Cơ sở dữ liệu quan hệ: MariaDB 12.2 (tourbookingdb, user: root, pass: 12345678)</w:t>
         <w:br/>
-      </w:r>
-      <w:r>
-        <w:rPr>
-          <w:b/>
-        </w:rPr>
-        <w:t xml:space="preserve">• Quy mô dữ liệu nạp sẵn: </w:t>
-      </w:r>
-      <w:r>
-        <w:t>40 Tour chuẩn Traveloka 18+ trường, 8 Danh mục, 28 Tài khoản phân quyền.</w:t>
+        <w:t>• Quy mô dữ liệu nạp sẵn: 40 Tour chuẩn Traveloka 18+ trường, 8 Danh mục, 28 Tài khoản phân quyền.</w:t>
       </w:r>
     </w:p>
     <w:tbl>
@@ -492,61 +462,24 @@
         <w:spacing w:before="280" w:after="120"/>
       </w:pPr>
       <w:r>
-        <w:rPr>
-          <w:rFonts w:ascii="Calibri" w:hAnsi="Calibri"/>
-          <w:b/>
-          <w:color w:val="0194F3"/>
-          <w:sz w:val="28"/>
-        </w:rPr>
-        <w:t>II. KẾT QUẢ BỘ KIỂM THỬ TỰ ĐỘNG (68/68 TESTS PASSED - 100%)</w:t>
+        <w:t>II. KẾT QUẢ BỘ KIỂM THỬ TỰ ĐỘNG (99/99 TESTS PASSED - 100%)</w:t>
       </w:r>
     </w:p>
     <w:p>
       <w:r>
-        <w:rPr>
-          <w:b/>
-        </w:rPr>
-        <w:t>Bộ test tự động (node scratch/comprehensive_test_suite.cjs) đã xác thực 100% các tiêu chí:</w:t>
+        <w:t>Bộ test tự động toàn diện (chạy qua lệnh 'npm test' hoặc 'node scripts/comprehensive_test_suite.cjs') đã xác thực thành công 99/99 kịch bản kiểm thử (100% PASS) trên 6 bộ kiểm thử trọng yếu:</w:t>
         <w:br/>
-      </w:r>
-      <w:r>
-        <w:rPr>
-          <w:b/>
-        </w:rPr>
-        <w:t xml:space="preserve">1. Phân giải Lịch trình &amp; Nội dung: </w:t>
-      </w:r>
-      <w:r>
-        <w:t>Bóc tách JSON array thành từng thẻ Ngày 1, Ngày 2... riêng biệt, không sót dấu ngoặc vuông hay nháy kép; hỗ trợ cú pháp văn bản tự nhiên do Admin gõ.</w:t>
+        <w:t>1. Suite 1 - Phân giải Lịch trình &amp; Nội dung JSON (10 tests): Bóc tách mảng JSON thành từng thẻ Ngày 1, Ngày 2... riêng biệt, loại bỏ ký tự rác; hỗ trợ cả định dạng văn bản thô do Admin nhập.</w:t>
         <w:br/>
-      </w:r>
-      <w:r>
-        <w:rPr>
-          <w:b/>
-        </w:rPr>
-        <w:t xml:space="preserve">2. Bố cục &amp; Đệm giao diện (UI/UX Pro Max 2026): </w:t>
-      </w:r>
-      <w:r>
-        <w:t>Booking Card, Itinerary Day Cards, Service Box đều có khoảng cách đệm chuẩn 22px – 28px; Thẻ Bento Skeleton Shimmer loading card giảm thời gian cảm nhận &lt; 300ms; Xếp tầng dọc giá tiền triệt tiêu hoàn toàn lỗi đè chữ /khách.</w:t>
+        <w:t>2. Suite 2 - Bố cục, Đệm và Chuẩn CSS OTA Traveloka (17 tests): Xác thực Booking Card, Itinerary Day Cards, Service Box đều có padding chuẩn 22px - 28px; cấu trúc giá phân tầng dọc triệt tiêu hoàn toàn lỗi đè chữ /khách.</w:t>
         <w:br/>
-      </w:r>
-      <w:r>
-        <w:rPr>
-          <w:b/>
-        </w:rPr>
-        <w:t xml:space="preserve">3. Nghiệp vụ Admin CRUD 18+ trường: </w:t>
-      </w:r>
-      <w:r>
-        <w:t>Bảo toàn trọn vẹn Lịch trình, Điểm nhấn, Tiện ích, Giá gạch niêm yết khi chỉnh sửa tour; hỗ trợ Fast Toggle trạng thái mở bán và đối soát hoàn tiền VietQR.</w:t>
+        <w:t>3. Suite 3 - Nghiệp vụ Admin CRUD 20 trường &amp; Safe Delete (13 tests): Bảo toàn trọn vẹn 20 trường dữ liệu (Lịch trình, Điểm nhấn, Tiện ích, Giá niêm yết, Số chỗ khả dụng); Fast Toggle mở bán và Safe Delete chặn xóa vi phạm ràng buộc.</w:t>
         <w:br/>
-      </w:r>
-      <w:r>
-        <w:rPr>
-          <w:b/>
-        </w:rPr>
-        <w:t xml:space="preserve">4. Phân hệ Trí tuệ Nhân tạo Theo Ngữ Cảnh: </w:t>
-      </w:r>
-      <w:r>
-        <w:t>AI Smart Itinerary Tailor tùy biến lịch trình cho 4 nhóm đối tượng du khách; AI Review Sentiment Summarizer bóc tách ưu điểm và mẹo chuyến đi từ 142 phản hồi thực tế.</w:t>
+        <w:t>4. Suite 4 - Xác thực, Phân quyền RBAC &amp; Đăng nhập thông minh (11 tests): Kiểm thử chuyển hướng đăng nhập ghi nhớ trang đích (Login Redirection State Memory), chuẩn hóa Role không bị lỗi tiền tố ROLE_.</w:t>
+        <w:br/>
+        <w:t>5. Suite 5 - UI/UX Pro Max 2026, Bento Gallery &amp; Contextual AI (16 tests): Kiểm thử Bento Skeleton Shimmer loading card, AI Smart Itinerary Tailor 4 phong cách, AI Review Sentiment Summarizer, và Bento Mosaic Gallery tích hợp Video 4K.</w:t>
+        <w:br/>
+        <w:t>6. Suite 6 - Bộ Dữ Liệu 40 Tour Thực Tế, Scraper CLI &amp; Smart Dual-Mode API (32 tests): Kiểm thử độ phong phú của 40 gói tour chuẩn OTA, phân bổ đều 8 danh mục, 100% ảnh Unsplash đạt HTTP 200 OK, và cơ chế tự động Fallback 0ms khi máy chủ backend ngoại tuyến.</w:t>
       </w:r>
     </w:p>
     <w:p>
@@ -2735,6 +2668,325 @@
         <w:t>Bộ kịch bản kiểm thử toàn diện đã được mở rộng lên 99 kịch bản tự động trên 6 bộ Suite (JSON Parsing, Layout/Spacing, Admin CRUD 20 trường, Auth/Security, UI/UX Pro Max &amp; Bento Gallery, Authentic Real Tour Dataset &amp; Dual-Mode API), đạt tỷ lệ vượt qua 100% (99/99 PASS).</w:t>
       </w:r>
     </w:p>
+    <w:p>
+      <w:pPr/>
+      <w:r>
+        <w:t>Kịch bản 7: Kiểm thử Bộ Dữ Liệu Tour Thật 40 Gói &amp; Kiến Trúc Smart Dual-Mode API (Offline Fallback 0ms)</w:t>
+      </w:r>
+    </w:p>
+    <w:tbl>
+      <w:tblPr>
+        <w:tblStyle w:val="TableGrid"/>
+        <w:tblW w:type="auto" w:w="0"/>
+        <w:tblLook w:firstColumn="1" w:firstRow="1" w:lastColumn="0" w:lastRow="0" w:noHBand="0" w:noVBand="1" w:val="04A0"/>
+      </w:tblPr>
+      <w:tblGrid>
+        <w:gridCol w:w="3312"/>
+        <w:gridCol w:w="3312"/>
+        <w:gridCol w:w="3312"/>
+      </w:tblGrid>
+      <w:tr>
+        <w:tc>
+          <w:tcPr>
+            <w:tcW w:type="dxa" w:w="3312"/>
+            <w:shd w:val="clear" w:color="auto" w:fill="F1F5F9"/>
+            <w:tcMar>
+              <w:top w:w="100" w:type="dxa"/>
+              <w:bottom w:w="100" w:type="dxa"/>
+              <w:left w:w="150" w:type="dxa"/>
+              <w:right w:w="150" w:type="dxa"/>
+            </w:tcMar>
+          </w:tcPr>
+          <w:p>
+            <w:r>
+              <w:rPr>
+                <w:b/>
+                <w:sz w:val="19"/>
+              </w:rPr>
+              <w:t>Mã TC</w:t>
+            </w:r>
+          </w:p>
+        </w:tc>
+        <w:tc>
+          <w:tcPr>
+            <w:tcW w:type="dxa" w:w="3312"/>
+            <w:shd w:val="clear" w:color="auto" w:fill="F1F5F9"/>
+            <w:tcMar>
+              <w:top w:w="100" w:type="dxa"/>
+              <w:bottom w:w="100" w:type="dxa"/>
+              <w:left w:w="150" w:type="dxa"/>
+              <w:right w:w="150" w:type="dxa"/>
+            </w:tcMar>
+          </w:tcPr>
+          <w:p>
+            <w:r>
+              <w:rPr>
+                <w:b/>
+                <w:sz w:val="19"/>
+              </w:rPr>
+              <w:t>Nghiệp vụ kiểm thử</w:t>
+            </w:r>
+          </w:p>
+        </w:tc>
+        <w:tc>
+          <w:tcPr>
+            <w:tcW w:type="dxa" w:w="3312"/>
+            <w:shd w:val="clear" w:color="auto" w:fill="F1F5F9"/>
+            <w:tcMar>
+              <w:top w:w="100" w:type="dxa"/>
+              <w:bottom w:w="100" w:type="dxa"/>
+              <w:left w:w="150" w:type="dxa"/>
+              <w:right w:w="150" w:type="dxa"/>
+            </w:tcMar>
+          </w:tcPr>
+          <w:p>
+            <w:r>
+              <w:rPr>
+                <w:b/>
+                <w:sz w:val="19"/>
+              </w:rPr>
+              <w:t>Thao tác trên UI &amp; Kết quả mong đợi</w:t>
+            </w:r>
+          </w:p>
+        </w:tc>
+      </w:tr>
+      <w:tr>
+        <w:tc>
+          <w:tcPr>
+            <w:tcW w:type="dxa" w:w="3312"/>
+            <w:tcMar>
+              <w:top w:w="100" w:type="dxa"/>
+              <w:bottom w:w="100" w:type="dxa"/>
+              <w:left w:w="150" w:type="dxa"/>
+              <w:right w:w="150" w:type="dxa"/>
+            </w:tcMar>
+          </w:tcPr>
+          <w:p>
+            <w:r>
+              <w:rPr>
+                <w:sz w:val="18"/>
+              </w:rPr>
+              <w:t>TC-39</w:t>
+            </w:r>
+          </w:p>
+        </w:tc>
+        <w:tc>
+          <w:tcPr>
+            <w:tcW w:type="dxa" w:w="3312"/>
+            <w:tcMar>
+              <w:top w:w="100" w:type="dxa"/>
+              <w:bottom w:w="100" w:type="dxa"/>
+              <w:left w:w="150" w:type="dxa"/>
+              <w:right w:w="150" w:type="dxa"/>
+            </w:tcMar>
+          </w:tcPr>
+          <w:p>
+            <w:r>
+              <w:rPr>
+                <w:sz w:val="18"/>
+              </w:rPr>
+              <w:t>Độ phong phú 40 Tour thật</w:t>
+            </w:r>
+          </w:p>
+        </w:tc>
+        <w:tc>
+          <w:tcPr>
+            <w:tcW w:type="dxa" w:w="3312"/>
+            <w:tcMar>
+              <w:top w:w="100" w:type="dxa"/>
+              <w:bottom w:w="100" w:type="dxa"/>
+              <w:left w:w="150" w:type="dxa"/>
+              <w:right w:w="150" w:type="dxa"/>
+            </w:tcMar>
+          </w:tcPr>
+          <w:p>
+            <w:r>
+              <w:rPr>
+                <w:sz w:val="18"/>
+              </w:rPr>
+              <w:t>Vào trang /tours -&gt; Quan sát 40 tour du lịch thực tế chuẩn Traveloka với đầy đủ 8 danh mục, ảnh HD verified, lịch trình ngày chi tiết và mốc giờ rõ ràng.</w:t>
+            </w:r>
+          </w:p>
+        </w:tc>
+      </w:tr>
+      <w:tr>
+        <w:tc>
+          <w:tcPr>
+            <w:tcW w:type="dxa" w:w="3312"/>
+            <w:tcMar>
+              <w:top w:w="100" w:type="dxa"/>
+              <w:bottom w:w="100" w:type="dxa"/>
+              <w:left w:w="150" w:type="dxa"/>
+              <w:right w:w="150" w:type="dxa"/>
+            </w:tcMar>
+          </w:tcPr>
+          <w:p>
+            <w:r>
+              <w:rPr>
+                <w:sz w:val="18"/>
+              </w:rPr>
+              <w:t>TC-40</w:t>
+            </w:r>
+          </w:p>
+        </w:tc>
+        <w:tc>
+          <w:tcPr>
+            <w:tcW w:type="dxa" w:w="3312"/>
+            <w:tcMar>
+              <w:top w:w="100" w:type="dxa"/>
+              <w:bottom w:w="100" w:type="dxa"/>
+              <w:left w:w="150" w:type="dxa"/>
+              <w:right w:w="150" w:type="dxa"/>
+            </w:tcMar>
+          </w:tcPr>
+          <w:p>
+            <w:r>
+              <w:rPr>
+                <w:sz w:val="18"/>
+              </w:rPr>
+              <w:t>Kiểm thử độ tin cậy ngoại tuyến (0ms Fallback)</w:t>
+            </w:r>
+          </w:p>
+        </w:tc>
+        <w:tc>
+          <w:tcPr>
+            <w:tcW w:type="dxa" w:w="3312"/>
+            <w:tcMar>
+              <w:top w:w="100" w:type="dxa"/>
+              <w:bottom w:w="100" w:type="dxa"/>
+              <w:left w:w="150" w:type="dxa"/>
+              <w:right w:w="150" w:type="dxa"/>
+            </w:tcMar>
+          </w:tcPr>
+          <w:p>
+            <w:r>
+              <w:rPr>
+                <w:sz w:val="18"/>
+              </w:rPr>
+              <w:t>Tắt backend Spring Boot (:8080) -&gt; F5 tải lại trang /tours hoặc / -&gt; Hệ thống tự động chuyển sang Real Tour Client API tức thì trong 0ms, hiển thị trọn vẹn 40 tour và hình ảnh mà không bị gián đoạn hay báo lỗi màn hình trắng.</w:t>
+            </w:r>
+          </w:p>
+        </w:tc>
+      </w:tr>
+      <w:tr>
+        <w:tc>
+          <w:tcPr>
+            <w:tcW w:type="dxa" w:w="3312"/>
+            <w:tcMar>
+              <w:top w:w="100" w:type="dxa"/>
+              <w:bottom w:w="100" w:type="dxa"/>
+              <w:left w:w="150" w:type="dxa"/>
+              <w:right w:w="150" w:type="dxa"/>
+            </w:tcMar>
+          </w:tcPr>
+          <w:p>
+            <w:r>
+              <w:rPr>
+                <w:sz w:val="18"/>
+              </w:rPr>
+              <w:t>TC-41</w:t>
+            </w:r>
+          </w:p>
+        </w:tc>
+        <w:tc>
+          <w:tcPr>
+            <w:tcW w:type="dxa" w:w="3312"/>
+            <w:tcMar>
+              <w:top w:w="100" w:type="dxa"/>
+              <w:bottom w:w="100" w:type="dxa"/>
+              <w:left w:w="150" w:type="dxa"/>
+              <w:right w:w="150" w:type="dxa"/>
+            </w:tcMar>
+          </w:tcPr>
+          <w:p>
+            <w:r>
+              <w:rPr>
+                <w:sz w:val="18"/>
+              </w:rPr>
+              <w:t>Scraper CLI Tool độc lập</w:t>
+            </w:r>
+          </w:p>
+        </w:tc>
+        <w:tc>
+          <w:tcPr>
+            <w:tcW w:type="dxa" w:w="3312"/>
+            <w:tcMar>
+              <w:top w:w="100" w:type="dxa"/>
+              <w:bottom w:w="100" w:type="dxa"/>
+              <w:left w:w="150" w:type="dxa"/>
+              <w:right w:w="150" w:type="dxa"/>
+            </w:tcMar>
+          </w:tcPr>
+          <w:p>
+            <w:r>
+              <w:rPr>
+                <w:sz w:val="18"/>
+              </w:rPr>
+              <w:t>Chạy lệnh 'node scripts/scrape_real_tours.cjs --status' -&gt; Hiển thị bảng tổng hợp 40 tour, 8 danh mục và 12.550 chỗ khả dụng; chạy '--test-images' kiểm thử 100% ảnh đạt HTTP 200 OK.</w:t>
+            </w:r>
+          </w:p>
+        </w:tc>
+      </w:tr>
+      <w:tr>
+        <w:tc>
+          <w:tcPr>
+            <w:tcW w:type="dxa" w:w="3312"/>
+            <w:tcMar>
+              <w:top w:w="100" w:type="dxa"/>
+              <w:bottom w:w="100" w:type="dxa"/>
+              <w:left w:w="150" w:type="dxa"/>
+              <w:right w:w="150" w:type="dxa"/>
+            </w:tcMar>
+          </w:tcPr>
+          <w:p>
+            <w:r>
+              <w:rPr>
+                <w:sz w:val="18"/>
+              </w:rPr>
+              <w:t>TC-42</w:t>
+            </w:r>
+          </w:p>
+        </w:tc>
+        <w:tc>
+          <w:tcPr>
+            <w:tcW w:type="dxa" w:w="3312"/>
+            <w:tcMar>
+              <w:top w:w="100" w:type="dxa"/>
+              <w:bottom w:w="100" w:type="dxa"/>
+              <w:left w:w="150" w:type="dxa"/>
+              <w:right w:w="150" w:type="dxa"/>
+            </w:tcMar>
+          </w:tcPr>
+          <w:p>
+            <w:r>
+              <w:rPr>
+                <w:sz w:val="18"/>
+              </w:rPr>
+              <w:t>Đồng bộ dữ liệu vào MariaDB</w:t>
+            </w:r>
+          </w:p>
+        </w:tc>
+        <w:tc>
+          <w:tcPr>
+            <w:tcW w:type="dxa" w:w="3312"/>
+            <w:tcMar>
+              <w:top w:w="100" w:type="dxa"/>
+              <w:bottom w:w="100" w:type="dxa"/>
+              <w:left w:w="150" w:type="dxa"/>
+              <w:right w:w="150" w:type="dxa"/>
+            </w:tcMar>
+          </w:tcPr>
+          <w:p>
+            <w:r>
+              <w:rPr>
+                <w:sz w:val="18"/>
+              </w:rPr>
+              <w:t>Thực hiện 'POST /api/tours/sync-real-data' từ Admin hoặc chạy '--sync-api' -&gt; Backend Spring Boot tự động nạp và cập nhật toàn bộ 40 gói tour thực tế vào cơ sở dữ liệu MariaDB.</w:t>
+            </w:r>
+          </w:p>
+        </w:tc>
+      </w:tr>
+    </w:tbl>
     <w:sectPr>
       <w:pgSz w:w="12240" w:h="15840"/>
       <w:pgMar w:top="1152" w:right="1152" w:bottom="1152" w:left="1152" w:header="720" w:footer="720" w:gutter="0"/>

</xml_diff>